<commit_message>
updated last time to 14
</commit_message>
<xml_diff>
--- a/docs/ecostats_lectures/lecture_14/14_01_lecture_powerpoint.docx
+++ b/docs/ecostats_lectures/lecture_14/14_01_lecture_powerpoint.docx
@@ -7868,13 +7868,7 @@
         <w:t xml:space="preserve"> </w:t>
       </w:r>
       <w:r>
-        <w:t xml:space="preserve">ratio. ::: {.panel column=</w:t>
-      </w:r>
-      <w:r>
-        <w:t xml:space="preserve">“screen”</w:t>
-      </w:r>
-      <w:r>
-        <w:t xml:space="preserve">}</w:t>
+        <w:t xml:space="preserve">ratio.</w:t>
       </w:r>
     </w:p>
     <w:p>
@@ -8207,14 +8201,6 @@
           <w:rStyle w:val="DocumentationTok"/>
         </w:rPr>
         <w:t xml:space="preserve">## Number of Fisher Scoring iterations: 6</w:t>
-      </w:r>
-    </w:p>
-    <w:p>
-      <w:pPr>
-        <w:pStyle w:val="FirstParagraph"/>
-      </w:pPr>
-      <w:r>
-        <w:t xml:space="preserve">:::</w:t>
       </w:r>
     </w:p>
     <w:bookmarkEnd w:id="77"/>

</xml_diff>